<commit_message>
Hogar de Refugio: caratulas en verde (Varones sigue en granate)
Co-Authored-By: Claude Opus 5.5 <noreply@anthropic.com>
Claude-Session: https://claude.ai/code/session_0142t8T16igb3VKxUPwnQPq6
</commit_message>
<xml_diff>
--- a/entregables/CARATULAS_DRENAJE_PLUVIAL_HOGAR_REFUGIO.docx
+++ b/entregables/CARATULAS_DRENAJE_PLUVIAL_HOGAR_REFUGIO.docx
@@ -89,7 +89,7 @@
                 <w:b/>
                 <w:i w:val="0"/>
                 <w:sz w:val="34"/>
-                <w:color w:val="7B1E2B"/>
+                <w:color w:val="1E5E3B"/>
                 <w:spacing w:val="10"/>
               </w:rPr>
               <w:t>GOBIERNO REGIONAL SAN MARTÍN</w:t>
@@ -100,7 +100,7 @@
               <w:spacing w:before="0" w:after="40" w:line="240" w:lineRule="auto"/>
               <w:jc w:val="left"/>
               <w:pBdr>
-                <w:bottom w:val="single" w:sz="18" w:space="4" w:color="7B1E2B"/>
+                <w:bottom w:val="single" w:sz="18" w:space="4" w:color="1E5E3B"/>
               </w:pBdr>
             </w:pPr>
             <w:r>
@@ -128,7 +128,7 @@
           <w:rFonts w:ascii="Arial" w:hAnsi="Arial" w:eastAsia="Arial"/>
           <w:b/>
           <w:i w:val="0"/>
-          <w:color w:val="7B1E2B"/>
+          <w:color w:val="1E5E3B"/>
           <w:sz w:val="22"/>
         </w:rPr>
         <w:t>SERVICIO DE DISEÑO DE DRENAJE PLUVIAL PARA ELABORACIÓN DEL EXPEDIENTE TÉCNICO DE PI:</w:t>
@@ -159,7 +159,7 @@
           <w:rFonts w:ascii="Arial" w:hAnsi="Arial" w:eastAsia="Arial"/>
           <w:b/>
           <w:i w:val="0"/>
-          <w:color w:val="7B1E2B"/>
+          <w:color w:val="1E5E3B"/>
           <w:sz w:val="23"/>
         </w:rPr>
         <w:t>CUI N° 2675514</w:t>
@@ -277,7 +277,7 @@
               <w:bottom w:val="nil"/>
               <w:right w:val="nil"/>
             </w:tcBorders>
-            <w:shd w:val="clear" w:color="auto" w:fill="7B1E2B"/>
+            <w:shd w:val="clear" w:color="auto" w:fill="1E5E3B"/>
           </w:tcPr>
           <w:p>
             <w:pPr>
@@ -307,7 +307,7 @@
                 <w:b/>
                 <w:i w:val="0"/>
                 <w:sz w:val="22"/>
-                <w:color w:val="F2D7DB"/>
+                <w:color w:val="D6EEDD"/>
                 <w:spacing w:val="4"/>
               </w:rPr>
               <w:t>ESPECIALIDAD DE DRENAJE PLUVIAL</w:t>
@@ -346,7 +346,7 @@
             <w:tcW w:type="dxa" w:w="4819"/>
             <w:tcBorders>
               <w:top w:val="nil"/>
-              <w:left w:val="single" w:sz="24" w:color="7B1E2B"/>
+              <w:left w:val="single" w:sz="24" w:color="1E5E3B"/>
               <w:bottom w:val="nil"/>
               <w:right w:val="nil"/>
             </w:tcBorders>
@@ -363,7 +363,7 @@
                 <w:b/>
                 <w:i w:val="0"/>
                 <w:sz w:val="20"/>
-                <w:color w:val="7B1E2B"/>
+                <w:color w:val="1E5E3B"/>
                 <w:spacing w:val="6"/>
               </w:rPr>
               <w:t xml:space="preserve">   UBICACIÓN DEL PROYECTO</w:t>
@@ -447,7 +447,7 @@
             <w:tcW w:type="dxa" w:w="4819"/>
             <w:tcBorders>
               <w:top w:val="nil"/>
-              <w:left w:val="single" w:sz="24" w:color="7B1E2B"/>
+              <w:left w:val="single" w:sz="24" w:color="1E5E3B"/>
               <w:bottom w:val="nil"/>
               <w:right w:val="nil"/>
             </w:tcBorders>
@@ -464,7 +464,7 @@
                 <w:b/>
                 <w:i w:val="0"/>
                 <w:sz w:val="20"/>
-                <w:color w:val="7B1E2B"/>
+                <w:color w:val="1E5E3B"/>
                 <w:spacing w:val="6"/>
               </w:rPr>
               <w:t xml:space="preserve">   FECHA</w:t>
@@ -481,7 +481,7 @@
                 <w:b/>
                 <w:i w:val="0"/>
                 <w:sz w:val="30"/>
-                <w:color w:val="7B1E2B"/>
+                <w:color w:val="1E5E3B"/>
                 <w:spacing w:val="6"/>
               </w:rPr>
               <w:t xml:space="preserve">   SETIEMBRE - 2026</w:t>
@@ -585,7 +585,7 @@
                 <w:b/>
                 <w:i w:val="0"/>
                 <w:sz w:val="34"/>
-                <w:color w:val="7B1E2B"/>
+                <w:color w:val="1E5E3B"/>
                 <w:spacing w:val="10"/>
               </w:rPr>
               <w:t>GOBIERNO REGIONAL SAN MARTÍN</w:t>
@@ -596,7 +596,7 @@
               <w:spacing w:before="0" w:after="40" w:line="240" w:lineRule="auto"/>
               <w:jc w:val="left"/>
               <w:pBdr>
-                <w:bottom w:val="single" w:sz="18" w:space="4" w:color="7B1E2B"/>
+                <w:bottom w:val="single" w:sz="18" w:space="4" w:color="1E5E3B"/>
               </w:pBdr>
             </w:pPr>
             <w:r>
@@ -624,7 +624,7 @@
           <w:rFonts w:ascii="Arial" w:hAnsi="Arial" w:eastAsia="Arial"/>
           <w:b/>
           <w:i w:val="0"/>
-          <w:color w:val="7B1E2B"/>
+          <w:color w:val="1E5E3B"/>
           <w:sz w:val="22"/>
         </w:rPr>
         <w:t>SERVICIO DE DISEÑO DE DRENAJE PLUVIAL PARA ELABORACIÓN DEL EXPEDIENTE TÉCNICO DE PI:</w:t>
@@ -655,7 +655,7 @@
           <w:rFonts w:ascii="Arial" w:hAnsi="Arial" w:eastAsia="Arial"/>
           <w:b/>
           <w:i w:val="0"/>
-          <w:color w:val="7B1E2B"/>
+          <w:color w:val="1E5E3B"/>
           <w:sz w:val="23"/>
         </w:rPr>
         <w:t>CUI N° 2675514</w:t>
@@ -773,7 +773,7 @@
               <w:bottom w:val="nil"/>
               <w:right w:val="nil"/>
             </w:tcBorders>
-            <w:shd w:val="clear" w:color="auto" w:fill="7B1E2B"/>
+            <w:shd w:val="clear" w:color="auto" w:fill="1E5E3B"/>
           </w:tcPr>
           <w:p>
             <w:pPr>
@@ -803,7 +803,7 @@
                 <w:b/>
                 <w:i w:val="0"/>
                 <w:sz w:val="22"/>
-                <w:color w:val="F2D7DB"/>
+                <w:color w:val="D6EEDD"/>
                 <w:spacing w:val="4"/>
               </w:rPr>
               <w:t>DRENAJE PLUVIAL: CANALETAS, MONTANTES Y CUNETAS</w:t>
@@ -820,7 +820,7 @@
                 <w:b/>
                 <w:i w:val="0"/>
                 <w:sz w:val="22"/>
-                <w:color w:val="F2D7DB"/>
+                <w:color w:val="D6EEDD"/>
                 <w:spacing w:val="4"/>
               </w:rPr>
               <w:t>ESPECIALIDAD DE DRENAJE PLUVIAL</w:t>
@@ -859,7 +859,7 @@
             <w:tcW w:type="dxa" w:w="4819"/>
             <w:tcBorders>
               <w:top w:val="nil"/>
-              <w:left w:val="single" w:sz="24" w:color="7B1E2B"/>
+              <w:left w:val="single" w:sz="24" w:color="1E5E3B"/>
               <w:bottom w:val="nil"/>
               <w:right w:val="nil"/>
             </w:tcBorders>
@@ -876,7 +876,7 @@
                 <w:b/>
                 <w:i w:val="0"/>
                 <w:sz w:val="20"/>
-                <w:color w:val="7B1E2B"/>
+                <w:color w:val="1E5E3B"/>
                 <w:spacing w:val="6"/>
               </w:rPr>
               <w:t xml:space="preserve">   UBICACIÓN DEL PROYECTO</w:t>
@@ -960,7 +960,7 @@
             <w:tcW w:type="dxa" w:w="4819"/>
             <w:tcBorders>
               <w:top w:val="nil"/>
-              <w:left w:val="single" w:sz="24" w:color="7B1E2B"/>
+              <w:left w:val="single" w:sz="24" w:color="1E5E3B"/>
               <w:bottom w:val="nil"/>
               <w:right w:val="nil"/>
             </w:tcBorders>
@@ -977,7 +977,7 @@
                 <w:b/>
                 <w:i w:val="0"/>
                 <w:sz w:val="20"/>
-                <w:color w:val="7B1E2B"/>
+                <w:color w:val="1E5E3B"/>
                 <w:spacing w:val="6"/>
               </w:rPr>
               <w:t xml:space="preserve">   FECHA</w:t>
@@ -994,7 +994,7 @@
                 <w:b/>
                 <w:i w:val="0"/>
                 <w:sz w:val="30"/>
-                <w:color w:val="7B1E2B"/>
+                <w:color w:val="1E5E3B"/>
                 <w:spacing w:val="6"/>
               </w:rPr>
               <w:t xml:space="preserve">   SETIEMBRE - 2026</w:t>
@@ -1098,7 +1098,7 @@
                 <w:b/>
                 <w:i w:val="0"/>
                 <w:sz w:val="34"/>
-                <w:color w:val="7B1E2B"/>
+                <w:color w:val="1E5E3B"/>
                 <w:spacing w:val="10"/>
               </w:rPr>
               <w:t>GOBIERNO REGIONAL SAN MARTÍN</w:t>
@@ -1109,7 +1109,7 @@
               <w:spacing w:before="0" w:after="40" w:line="240" w:lineRule="auto"/>
               <w:jc w:val="left"/>
               <w:pBdr>
-                <w:bottom w:val="single" w:sz="18" w:space="4" w:color="7B1E2B"/>
+                <w:bottom w:val="single" w:sz="18" w:space="4" w:color="1E5E3B"/>
               </w:pBdr>
             </w:pPr>
             <w:r>
@@ -1137,7 +1137,7 @@
           <w:rFonts w:ascii="Arial" w:hAnsi="Arial" w:eastAsia="Arial"/>
           <w:b/>
           <w:i w:val="0"/>
-          <w:color w:val="7B1E2B"/>
+          <w:color w:val="1E5E3B"/>
           <w:sz w:val="22"/>
         </w:rPr>
         <w:t>SERVICIO DE DISEÑO DE DRENAJE PLUVIAL PARA ELABORACIÓN DEL EXPEDIENTE TÉCNICO DE PI:</w:t>
@@ -1168,7 +1168,7 @@
           <w:rFonts w:ascii="Arial" w:hAnsi="Arial" w:eastAsia="Arial"/>
           <w:b/>
           <w:i w:val="0"/>
-          <w:color w:val="7B1E2B"/>
+          <w:color w:val="1E5E3B"/>
           <w:sz w:val="23"/>
         </w:rPr>
         <w:t>CUI N° 2675514</w:t>
@@ -1286,7 +1286,7 @@
               <w:bottom w:val="nil"/>
               <w:right w:val="nil"/>
             </w:tcBorders>
-            <w:shd w:val="clear" w:color="auto" w:fill="7B1E2B"/>
+            <w:shd w:val="clear" w:color="auto" w:fill="1E5E3B"/>
           </w:tcPr>
           <w:p>
             <w:pPr>
@@ -1316,7 +1316,7 @@
                 <w:b/>
                 <w:i w:val="0"/>
                 <w:sz w:val="22"/>
-                <w:color w:val="F2D7DB"/>
+                <w:color w:val="D6EEDD"/>
                 <w:spacing w:val="4"/>
               </w:rPr>
               <w:t>COLECTOR PLUVIAL FRONTAL</w:t>
@@ -1333,7 +1333,7 @@
                 <w:b/>
                 <w:i w:val="0"/>
                 <w:sz w:val="22"/>
-                <w:color w:val="F2D7DB"/>
+                <w:color w:val="D6EEDD"/>
                 <w:spacing w:val="4"/>
               </w:rPr>
               <w:t>ESPECIALIDAD DE DRENAJE PLUVIAL</w:t>
@@ -1372,7 +1372,7 @@
             <w:tcW w:type="dxa" w:w="4819"/>
             <w:tcBorders>
               <w:top w:val="nil"/>
-              <w:left w:val="single" w:sz="24" w:color="7B1E2B"/>
+              <w:left w:val="single" w:sz="24" w:color="1E5E3B"/>
               <w:bottom w:val="nil"/>
               <w:right w:val="nil"/>
             </w:tcBorders>
@@ -1389,7 +1389,7 @@
                 <w:b/>
                 <w:i w:val="0"/>
                 <w:sz w:val="20"/>
-                <w:color w:val="7B1E2B"/>
+                <w:color w:val="1E5E3B"/>
                 <w:spacing w:val="6"/>
               </w:rPr>
               <w:t xml:space="preserve">   UBICACIÓN DEL PROYECTO</w:t>
@@ -1473,7 +1473,7 @@
             <w:tcW w:type="dxa" w:w="4819"/>
             <w:tcBorders>
               <w:top w:val="nil"/>
-              <w:left w:val="single" w:sz="24" w:color="7B1E2B"/>
+              <w:left w:val="single" w:sz="24" w:color="1E5E3B"/>
               <w:bottom w:val="nil"/>
               <w:right w:val="nil"/>
             </w:tcBorders>
@@ -1490,7 +1490,7 @@
                 <w:b/>
                 <w:i w:val="0"/>
                 <w:sz w:val="20"/>
-                <w:color w:val="7B1E2B"/>
+                <w:color w:val="1E5E3B"/>
                 <w:spacing w:val="6"/>
               </w:rPr>
               <w:t xml:space="preserve">   FECHA</w:t>
@@ -1507,7 +1507,7 @@
                 <w:b/>
                 <w:i w:val="0"/>
                 <w:sz w:val="30"/>
-                <w:color w:val="7B1E2B"/>
+                <w:color w:val="1E5E3B"/>
                 <w:spacing w:val="6"/>
               </w:rPr>
               <w:t xml:space="preserve">   SETIEMBRE - 2026</w:t>
@@ -1611,7 +1611,7 @@
                 <w:b/>
                 <w:i w:val="0"/>
                 <w:sz w:val="34"/>
-                <w:color w:val="7B1E2B"/>
+                <w:color w:val="1E5E3B"/>
                 <w:spacing w:val="10"/>
               </w:rPr>
               <w:t>GOBIERNO REGIONAL SAN MARTÍN</w:t>
@@ -1622,7 +1622,7 @@
               <w:spacing w:before="0" w:after="40" w:line="240" w:lineRule="auto"/>
               <w:jc w:val="left"/>
               <w:pBdr>
-                <w:bottom w:val="single" w:sz="18" w:space="4" w:color="7B1E2B"/>
+                <w:bottom w:val="single" w:sz="18" w:space="4" w:color="1E5E3B"/>
               </w:pBdr>
             </w:pPr>
             <w:r>
@@ -1650,7 +1650,7 @@
           <w:rFonts w:ascii="Arial" w:hAnsi="Arial" w:eastAsia="Arial"/>
           <w:b/>
           <w:i w:val="0"/>
-          <w:color w:val="7B1E2B"/>
+          <w:color w:val="1E5E3B"/>
           <w:sz w:val="22"/>
         </w:rPr>
         <w:t>SERVICIO DE DISEÑO DE DRENAJE PLUVIAL PARA ELABORACIÓN DEL EXPEDIENTE TÉCNICO DE PI:</w:t>
@@ -1681,7 +1681,7 @@
           <w:rFonts w:ascii="Arial" w:hAnsi="Arial" w:eastAsia="Arial"/>
           <w:b/>
           <w:i w:val="0"/>
-          <w:color w:val="7B1E2B"/>
+          <w:color w:val="1E5E3B"/>
           <w:sz w:val="23"/>
         </w:rPr>
         <w:t>CUI N° 2675514</w:t>
@@ -1799,7 +1799,7 @@
               <w:bottom w:val="nil"/>
               <w:right w:val="nil"/>
             </w:tcBorders>
-            <w:shd w:val="clear" w:color="auto" w:fill="7B1E2B"/>
+            <w:shd w:val="clear" w:color="auto" w:fill="1E5E3B"/>
           </w:tcPr>
           <w:p>
             <w:pPr>
@@ -1829,7 +1829,7 @@
                 <w:b/>
                 <w:i w:val="0"/>
                 <w:sz w:val="22"/>
-                <w:color w:val="F2D7DB"/>
+                <w:color w:val="D6EEDD"/>
                 <w:spacing w:val="4"/>
               </w:rPr>
               <w:t>ESPECIALIDAD DE DRENAJE PLUVIAL</w:t>
@@ -1868,7 +1868,7 @@
             <w:tcW w:type="dxa" w:w="4819"/>
             <w:tcBorders>
               <w:top w:val="nil"/>
-              <w:left w:val="single" w:sz="24" w:color="7B1E2B"/>
+              <w:left w:val="single" w:sz="24" w:color="1E5E3B"/>
               <w:bottom w:val="nil"/>
               <w:right w:val="nil"/>
             </w:tcBorders>
@@ -1885,7 +1885,7 @@
                 <w:b/>
                 <w:i w:val="0"/>
                 <w:sz w:val="20"/>
-                <w:color w:val="7B1E2B"/>
+                <w:color w:val="1E5E3B"/>
                 <w:spacing w:val="6"/>
               </w:rPr>
               <w:t xml:space="preserve">   UBICACIÓN DEL PROYECTO</w:t>
@@ -1969,7 +1969,7 @@
             <w:tcW w:type="dxa" w:w="4819"/>
             <w:tcBorders>
               <w:top w:val="nil"/>
-              <w:left w:val="single" w:sz="24" w:color="7B1E2B"/>
+              <w:left w:val="single" w:sz="24" w:color="1E5E3B"/>
               <w:bottom w:val="nil"/>
               <w:right w:val="nil"/>
             </w:tcBorders>
@@ -1986,7 +1986,7 @@
                 <w:b/>
                 <w:i w:val="0"/>
                 <w:sz w:val="20"/>
-                <w:color w:val="7B1E2B"/>
+                <w:color w:val="1E5E3B"/>
                 <w:spacing w:val="6"/>
               </w:rPr>
               <w:t xml:space="preserve">   FECHA</w:t>
@@ -2003,7 +2003,7 @@
                 <w:b/>
                 <w:i w:val="0"/>
                 <w:sz w:val="30"/>
-                <w:color w:val="7B1E2B"/>
+                <w:color w:val="1E5E3B"/>
                 <w:spacing w:val="6"/>
               </w:rPr>
               <w:t xml:space="preserve">   SETIEMBRE - 2026</w:t>
@@ -2107,7 +2107,7 @@
                 <w:b/>
                 <w:i w:val="0"/>
                 <w:sz w:val="34"/>
-                <w:color w:val="7B1E2B"/>
+                <w:color w:val="1E5E3B"/>
                 <w:spacing w:val="10"/>
               </w:rPr>
               <w:t>GOBIERNO REGIONAL SAN MARTÍN</w:t>
@@ -2118,7 +2118,7 @@
               <w:spacing w:before="0" w:after="40" w:line="240" w:lineRule="auto"/>
               <w:jc w:val="left"/>
               <w:pBdr>
-                <w:bottom w:val="single" w:sz="18" w:space="4" w:color="7B1E2B"/>
+                <w:bottom w:val="single" w:sz="18" w:space="4" w:color="1E5E3B"/>
               </w:pBdr>
             </w:pPr>
             <w:r>
@@ -2146,7 +2146,7 @@
           <w:rFonts w:ascii="Arial" w:hAnsi="Arial" w:eastAsia="Arial"/>
           <w:b/>
           <w:i w:val="0"/>
-          <w:color w:val="7B1E2B"/>
+          <w:color w:val="1E5E3B"/>
           <w:sz w:val="22"/>
         </w:rPr>
         <w:t>SERVICIO DE DISEÑO DE DRENAJE PLUVIAL PARA ELABORACIÓN DEL EXPEDIENTE TÉCNICO DE PI:</w:t>
@@ -2177,7 +2177,7 @@
           <w:rFonts w:ascii="Arial" w:hAnsi="Arial" w:eastAsia="Arial"/>
           <w:b/>
           <w:i w:val="0"/>
-          <w:color w:val="7B1E2B"/>
+          <w:color w:val="1E5E3B"/>
           <w:sz w:val="23"/>
         </w:rPr>
         <w:t>CUI N° 2675514</w:t>
@@ -2295,7 +2295,7 @@
               <w:bottom w:val="nil"/>
               <w:right w:val="nil"/>
             </w:tcBorders>
-            <w:shd w:val="clear" w:color="auto" w:fill="7B1E2B"/>
+            <w:shd w:val="clear" w:color="auto" w:fill="1E5E3B"/>
           </w:tcPr>
           <w:p>
             <w:pPr>
@@ -2325,7 +2325,7 @@
                 <w:b/>
                 <w:i w:val="0"/>
                 <w:sz w:val="22"/>
-                <w:color w:val="F2D7DB"/>
+                <w:color w:val="D6EEDD"/>
                 <w:spacing w:val="4"/>
               </w:rPr>
               <w:t>HIDROLOGÍA Y DRENAJE PLUVIAL CON COLECTOR FRONTAL</w:t>
@@ -2342,7 +2342,7 @@
                 <w:b/>
                 <w:i w:val="0"/>
                 <w:sz w:val="22"/>
-                <w:color w:val="F2D7DB"/>
+                <w:color w:val="D6EEDD"/>
                 <w:spacing w:val="4"/>
               </w:rPr>
               <w:t>ESPECIALIDAD DE DRENAJE PLUVIAL</w:t>
@@ -2381,7 +2381,7 @@
             <w:tcW w:type="dxa" w:w="4819"/>
             <w:tcBorders>
               <w:top w:val="nil"/>
-              <w:left w:val="single" w:sz="24" w:color="7B1E2B"/>
+              <w:left w:val="single" w:sz="24" w:color="1E5E3B"/>
               <w:bottom w:val="nil"/>
               <w:right w:val="nil"/>
             </w:tcBorders>
@@ -2398,7 +2398,7 @@
                 <w:b/>
                 <w:i w:val="0"/>
                 <w:sz w:val="20"/>
-                <w:color w:val="7B1E2B"/>
+                <w:color w:val="1E5E3B"/>
                 <w:spacing w:val="6"/>
               </w:rPr>
               <w:t xml:space="preserve">   UBICACIÓN DEL PROYECTO</w:t>
@@ -2482,7 +2482,7 @@
             <w:tcW w:type="dxa" w:w="4819"/>
             <w:tcBorders>
               <w:top w:val="nil"/>
-              <w:left w:val="single" w:sz="24" w:color="7B1E2B"/>
+              <w:left w:val="single" w:sz="24" w:color="1E5E3B"/>
               <w:bottom w:val="nil"/>
               <w:right w:val="nil"/>
             </w:tcBorders>
@@ -2499,7 +2499,7 @@
                 <w:b/>
                 <w:i w:val="0"/>
                 <w:sz w:val="20"/>
-                <w:color w:val="7B1E2B"/>
+                <w:color w:val="1E5E3B"/>
                 <w:spacing w:val="6"/>
               </w:rPr>
               <w:t xml:space="preserve">   FECHA</w:t>
@@ -2516,7 +2516,7 @@
                 <w:b/>
                 <w:i w:val="0"/>
                 <w:sz w:val="30"/>
-                <w:color w:val="7B1E2B"/>
+                <w:color w:val="1E5E3B"/>
                 <w:spacing w:val="6"/>
               </w:rPr>
               <w:t xml:space="preserve">   SETIEMBRE - 2026</w:t>
@@ -2620,7 +2620,7 @@
                 <w:b/>
                 <w:i w:val="0"/>
                 <w:sz w:val="34"/>
-                <w:color w:val="7B1E2B"/>
+                <w:color w:val="1E5E3B"/>
                 <w:spacing w:val="10"/>
               </w:rPr>
               <w:t>GOBIERNO REGIONAL SAN MARTÍN</w:t>
@@ -2631,7 +2631,7 @@
               <w:spacing w:before="0" w:after="40" w:line="240" w:lineRule="auto"/>
               <w:jc w:val="left"/>
               <w:pBdr>
-                <w:bottom w:val="single" w:sz="18" w:space="4" w:color="7B1E2B"/>
+                <w:bottom w:val="single" w:sz="18" w:space="4" w:color="1E5E3B"/>
               </w:pBdr>
             </w:pPr>
             <w:r>
@@ -2659,7 +2659,7 @@
           <w:rFonts w:ascii="Arial" w:hAnsi="Arial" w:eastAsia="Arial"/>
           <w:b/>
           <w:i w:val="0"/>
-          <w:color w:val="7B1E2B"/>
+          <w:color w:val="1E5E3B"/>
           <w:sz w:val="22"/>
         </w:rPr>
         <w:t>SERVICIO DE DISEÑO DE DRENAJE PLUVIAL PARA ELABORACIÓN DEL EXPEDIENTE TÉCNICO DE PI:</w:t>
@@ -2690,7 +2690,7 @@
           <w:rFonts w:ascii="Arial" w:hAnsi="Arial" w:eastAsia="Arial"/>
           <w:b/>
           <w:i w:val="0"/>
-          <w:color w:val="7B1E2B"/>
+          <w:color w:val="1E5E3B"/>
           <w:sz w:val="23"/>
         </w:rPr>
         <w:t>CUI N° 2675514</w:t>
@@ -2808,7 +2808,7 @@
               <w:bottom w:val="nil"/>
               <w:right w:val="nil"/>
             </w:tcBorders>
-            <w:shd w:val="clear" w:color="auto" w:fill="7B1E2B"/>
+            <w:shd w:val="clear" w:color="auto" w:fill="1E5E3B"/>
           </w:tcPr>
           <w:p>
             <w:pPr>
@@ -2838,7 +2838,7 @@
                 <w:b/>
                 <w:i w:val="0"/>
                 <w:sz w:val="22"/>
-                <w:color w:val="F2D7DB"/>
+                <w:color w:val="D6EEDD"/>
                 <w:spacing w:val="4"/>
               </w:rPr>
               <w:t>ESPECIALIDAD DE DRENAJE PLUVIAL</w:t>
@@ -2877,7 +2877,7 @@
             <w:tcW w:type="dxa" w:w="4819"/>
             <w:tcBorders>
               <w:top w:val="nil"/>
-              <w:left w:val="single" w:sz="24" w:color="7B1E2B"/>
+              <w:left w:val="single" w:sz="24" w:color="1E5E3B"/>
               <w:bottom w:val="nil"/>
               <w:right w:val="nil"/>
             </w:tcBorders>
@@ -2894,7 +2894,7 @@
                 <w:b/>
                 <w:i w:val="0"/>
                 <w:sz w:val="20"/>
-                <w:color w:val="7B1E2B"/>
+                <w:color w:val="1E5E3B"/>
                 <w:spacing w:val="6"/>
               </w:rPr>
               <w:t xml:space="preserve">   UBICACIÓN DEL PROYECTO</w:t>
@@ -2978,7 +2978,7 @@
             <w:tcW w:type="dxa" w:w="4819"/>
             <w:tcBorders>
               <w:top w:val="nil"/>
-              <w:left w:val="single" w:sz="24" w:color="7B1E2B"/>
+              <w:left w:val="single" w:sz="24" w:color="1E5E3B"/>
               <w:bottom w:val="nil"/>
               <w:right w:val="nil"/>
             </w:tcBorders>
@@ -2995,7 +2995,7 @@
                 <w:b/>
                 <w:i w:val="0"/>
                 <w:sz w:val="20"/>
-                <w:color w:val="7B1E2B"/>
+                <w:color w:val="1E5E3B"/>
                 <w:spacing w:val="6"/>
               </w:rPr>
               <w:t xml:space="preserve">   FECHA</w:t>
@@ -3012,7 +3012,7 @@
                 <w:b/>
                 <w:i w:val="0"/>
                 <w:sz w:val="30"/>
-                <w:color w:val="7B1E2B"/>
+                <w:color w:val="1E5E3B"/>
                 <w:spacing w:val="6"/>
               </w:rPr>
               <w:t xml:space="preserve">   SETIEMBRE - 2026</w:t>
@@ -3116,7 +3116,7 @@
                 <w:b/>
                 <w:i w:val="0"/>
                 <w:sz w:val="34"/>
-                <w:color w:val="7B1E2B"/>
+                <w:color w:val="1E5E3B"/>
                 <w:spacing w:val="10"/>
               </w:rPr>
               <w:t>GOBIERNO REGIONAL SAN MARTÍN</w:t>
@@ -3127,7 +3127,7 @@
               <w:spacing w:before="0" w:after="40" w:line="240" w:lineRule="auto"/>
               <w:jc w:val="left"/>
               <w:pBdr>
-                <w:bottom w:val="single" w:sz="18" w:space="4" w:color="7B1E2B"/>
+                <w:bottom w:val="single" w:sz="18" w:space="4" w:color="1E5E3B"/>
               </w:pBdr>
             </w:pPr>
             <w:r>
@@ -3155,7 +3155,7 @@
           <w:rFonts w:ascii="Arial" w:hAnsi="Arial" w:eastAsia="Arial"/>
           <w:b/>
           <w:i w:val="0"/>
-          <w:color w:val="7B1E2B"/>
+          <w:color w:val="1E5E3B"/>
           <w:sz w:val="22"/>
         </w:rPr>
         <w:t>SERVICIO DE DISEÑO DE DRENAJE PLUVIAL PARA ELABORACIÓN DEL EXPEDIENTE TÉCNICO DE PI:</w:t>
@@ -3186,7 +3186,7 @@
           <w:rFonts w:ascii="Arial" w:hAnsi="Arial" w:eastAsia="Arial"/>
           <w:b/>
           <w:i w:val="0"/>
-          <w:color w:val="7B1E2B"/>
+          <w:color w:val="1E5E3B"/>
           <w:sz w:val="23"/>
         </w:rPr>
         <w:t>CUI N° 2675514</w:t>
@@ -3304,7 +3304,7 @@
               <w:bottom w:val="nil"/>
               <w:right w:val="nil"/>
             </w:tcBorders>
-            <w:shd w:val="clear" w:color="auto" w:fill="7B1E2B"/>
+            <w:shd w:val="clear" w:color="auto" w:fill="1E5E3B"/>
           </w:tcPr>
           <w:p>
             <w:pPr>
@@ -3334,7 +3334,7 @@
                 <w:b/>
                 <w:i w:val="0"/>
                 <w:sz w:val="22"/>
-                <w:color w:val="F2D7DB"/>
+                <w:color w:val="D6EEDD"/>
                 <w:spacing w:val="4"/>
               </w:rPr>
               <w:t>LÁMINAS DPL-01 A DPL-40</w:t>
@@ -3351,7 +3351,7 @@
                 <w:b/>
                 <w:i w:val="0"/>
                 <w:sz w:val="22"/>
-                <w:color w:val="F2D7DB"/>
+                <w:color w:val="D6EEDD"/>
                 <w:spacing w:val="4"/>
               </w:rPr>
               <w:t>ESPECIALIDAD DE DRENAJE PLUVIAL</w:t>
@@ -3390,7 +3390,7 @@
             <w:tcW w:type="dxa" w:w="4819"/>
             <w:tcBorders>
               <w:top w:val="nil"/>
-              <w:left w:val="single" w:sz="24" w:color="7B1E2B"/>
+              <w:left w:val="single" w:sz="24" w:color="1E5E3B"/>
               <w:bottom w:val="nil"/>
               <w:right w:val="nil"/>
             </w:tcBorders>
@@ -3407,7 +3407,7 @@
                 <w:b/>
                 <w:i w:val="0"/>
                 <w:sz w:val="20"/>
-                <w:color w:val="7B1E2B"/>
+                <w:color w:val="1E5E3B"/>
                 <w:spacing w:val="6"/>
               </w:rPr>
               <w:t xml:space="preserve">   UBICACIÓN DEL PROYECTO</w:t>
@@ -3491,7 +3491,7 @@
             <w:tcW w:type="dxa" w:w="4819"/>
             <w:tcBorders>
               <w:top w:val="nil"/>
-              <w:left w:val="single" w:sz="24" w:color="7B1E2B"/>
+              <w:left w:val="single" w:sz="24" w:color="1E5E3B"/>
               <w:bottom w:val="nil"/>
               <w:right w:val="nil"/>
             </w:tcBorders>
@@ -3508,7 +3508,7 @@
                 <w:b/>
                 <w:i w:val="0"/>
                 <w:sz w:val="20"/>
-                <w:color w:val="7B1E2B"/>
+                <w:color w:val="1E5E3B"/>
                 <w:spacing w:val="6"/>
               </w:rPr>
               <w:t xml:space="preserve">   FECHA</w:t>
@@ -3525,7 +3525,7 @@
                 <w:b/>
                 <w:i w:val="0"/>
                 <w:sz w:val="30"/>
-                <w:color w:val="7B1E2B"/>
+                <w:color w:val="1E5E3B"/>
                 <w:spacing w:val="6"/>
               </w:rPr>
               <w:t xml:space="preserve">   SETIEMBRE - 2026</w:t>

</xml_diff>